<commit_message>
Correciones de clase 22/4
</commit_message>
<xml_diff>
--- a/TP2/2026_RI_TP2_TP_Modelos.docx
+++ b/TP2/2026_RI_TP2_TP_Modelos.docx
@@ -134,7 +134,25 @@
           <w:sz w:val="20"/>
           <w:szCs w:val="20"/>
         </w:rPr>
-        <w:t>Fecha de entrega: 22/04/2026</w:t>
+        <w:t>Fecha de entrega: 2</w:t>
+      </w:r>
+      <w:r>
+        <w:rPr>
+          <w:b/>
+          <w:color w:val="000000"/>
+          <w:sz w:val="20"/>
+          <w:szCs w:val="20"/>
+        </w:rPr>
+        <w:t>3</w:t>
+      </w:r>
+      <w:r>
+        <w:rPr>
+          <w:b/>
+          <w:color w:val="000000"/>
+          <w:sz w:val="20"/>
+          <w:szCs w:val="20"/>
+        </w:rPr>
+        <w:t>/04/2026</w:t>
       </w:r>
     </w:p>
     <w:p>
@@ -6450,7 +6468,23 @@
           <w:sz w:val="24"/>
           <w:szCs w:val="24"/>
         </w:rPr>
-        <w:t>Fue necesario una revisión de las palabras que estaban en la query para confirmar que la formula hacia lo correcto.</w:t>
+        <w:t xml:space="preserve">Fue necesario una revisión de las palabras que estaban en la </w:t>
+      </w:r>
+      <w:proofErr w:type="spellStart"/>
+      <w:r>
+        <w:rPr>
+          <w:sz w:val="24"/>
+          <w:szCs w:val="24"/>
+        </w:rPr>
+        <w:t>query</w:t>
+      </w:r>
+      <w:proofErr w:type="spellEnd"/>
+      <w:r>
+        <w:rPr>
+          <w:sz w:val="24"/>
+          <w:szCs w:val="24"/>
+        </w:rPr>
+        <w:t xml:space="preserve"> para confirmar que la formula hacia lo correcto.</w:t>
       </w:r>
       <w:r>
         <w:rPr>
@@ -16648,7 +16682,23 @@
           <w:sz w:val="24"/>
           <w:szCs w:val="24"/>
         </w:rPr>
-        <w:t>que estaban en la query para confirmar que la formula hacia lo correcto.</w:t>
+        <w:t xml:space="preserve">que estaban en la </w:t>
+      </w:r>
+      <w:proofErr w:type="spellStart"/>
+      <w:r>
+        <w:rPr>
+          <w:sz w:val="24"/>
+          <w:szCs w:val="24"/>
+        </w:rPr>
+        <w:t>query</w:t>
+      </w:r>
+      <w:proofErr w:type="spellEnd"/>
+      <w:r>
+        <w:rPr>
+          <w:sz w:val="24"/>
+          <w:szCs w:val="24"/>
+        </w:rPr>
+        <w:t xml:space="preserve"> para confirmar que la formula hacia lo correcto.</w:t>
       </w:r>
       <w:r>
         <w:rPr>
@@ -28222,6 +28272,7 @@
         </w:rPr>
         <w:t>. Tome 5 necesidades de información y, de forma manual, derive una consulta (</w:t>
       </w:r>
+      <w:proofErr w:type="spellStart"/>
       <w:r>
         <w:rPr>
           <w:i/>
@@ -28232,6 +28283,7 @@
         </w:rPr>
         <w:t>query</w:t>
       </w:r>
+      <w:proofErr w:type="spellEnd"/>
       <w:r>
         <w:rPr>
           <w:color w:val="FABF8F" w:themeColor="accent6" w:themeTint="99"/>
@@ -28451,7 +28503,23 @@
           <w:sz w:val="24"/>
           <w:szCs w:val="24"/>
         </w:rPr>
-        <w:t>Analizando los rankings de cada modelo con cada query, analizo lo siguiente:</w:t>
+        <w:t xml:space="preserve">Analizando los rankings de cada modelo con cada </w:t>
+      </w:r>
+      <w:proofErr w:type="spellStart"/>
+      <w:r>
+        <w:rPr>
+          <w:sz w:val="24"/>
+          <w:szCs w:val="24"/>
+        </w:rPr>
+        <w:t>query</w:t>
+      </w:r>
+      <w:proofErr w:type="spellEnd"/>
+      <w:r>
+        <w:rPr>
+          <w:sz w:val="24"/>
+          <w:szCs w:val="24"/>
+        </w:rPr>
+        <w:t>, analizo lo siguiente:</w:t>
       </w:r>
     </w:p>
     <w:p>
@@ -28471,7 +28539,39 @@
           <w:sz w:val="24"/>
           <w:szCs w:val="24"/>
         </w:rPr>
-        <w:t>En todas las querys (menos la 3), el orden de los documentos es el mismo o casi igual. No varia mucho el ranking pero si el score.</w:t>
+        <w:t xml:space="preserve">En todas las </w:t>
+      </w:r>
+      <w:proofErr w:type="spellStart"/>
+      <w:r>
+        <w:rPr>
+          <w:sz w:val="24"/>
+          <w:szCs w:val="24"/>
+        </w:rPr>
+        <w:t>querys</w:t>
+      </w:r>
+      <w:proofErr w:type="spellEnd"/>
+      <w:r>
+        <w:rPr>
+          <w:sz w:val="24"/>
+          <w:szCs w:val="24"/>
+        </w:rPr>
+        <w:t xml:space="preserve"> (menos la 3), el orden de los documentos es el mismo o casi igual. No </w:t>
+      </w:r>
+      <w:proofErr w:type="spellStart"/>
+      <w:r>
+        <w:rPr>
+          <w:sz w:val="24"/>
+          <w:szCs w:val="24"/>
+        </w:rPr>
+        <w:t>varia</w:t>
+      </w:r>
+      <w:proofErr w:type="spellEnd"/>
+      <w:r>
+        <w:rPr>
+          <w:sz w:val="24"/>
+          <w:szCs w:val="24"/>
+        </w:rPr>
+        <w:t xml:space="preserve"> mucho el ranking pero si el score.</w:t>
       </w:r>
     </w:p>
     <w:p>
@@ -28514,7 +28614,23 @@
           <w:sz w:val="24"/>
           <w:szCs w:val="24"/>
         </w:rPr>
-        <w:t xml:space="preserve">En la query 4, el orden de los documentos entre ambos documentos cambia ligeramente, confirmando que BM25 considera la saturación de los términos </w:t>
+        <w:t xml:space="preserve">En la </w:t>
+      </w:r>
+      <w:proofErr w:type="spellStart"/>
+      <w:r>
+        <w:rPr>
+          <w:sz w:val="24"/>
+          <w:szCs w:val="24"/>
+        </w:rPr>
+        <w:t>query</w:t>
+      </w:r>
+      <w:proofErr w:type="spellEnd"/>
+      <w:r>
+        <w:rPr>
+          <w:sz w:val="24"/>
+          <w:szCs w:val="24"/>
+        </w:rPr>
+        <w:t xml:space="preserve"> 4, el orden de los documentos entre ambos documentos cambia ligeramente, confirmando que BM25 considera la saturación de los términos </w:t>
       </w:r>
     </w:p>
     <w:p>
@@ -28534,7 +28650,55 @@
           <w:sz w:val="24"/>
           <w:szCs w:val="24"/>
         </w:rPr>
-        <w:t>En la query 3, se rompe esa correlación entre ambos modelos al utilizar un termino que aparece en todos los documentos (“Wikipedia”) con uno que es menos discriminativo (“Languages”).</w:t>
+        <w:t xml:space="preserve">En la </w:t>
+      </w:r>
+      <w:proofErr w:type="spellStart"/>
+      <w:r>
+        <w:rPr>
+          <w:sz w:val="24"/>
+          <w:szCs w:val="24"/>
+        </w:rPr>
+        <w:t>query</w:t>
+      </w:r>
+      <w:proofErr w:type="spellEnd"/>
+      <w:r>
+        <w:rPr>
+          <w:sz w:val="24"/>
+          <w:szCs w:val="24"/>
+        </w:rPr>
+        <w:t xml:space="preserve"> 3, se rompe esa correlación entre ambos modelos al utilizar un </w:t>
+      </w:r>
+      <w:proofErr w:type="spellStart"/>
+      <w:r>
+        <w:rPr>
+          <w:sz w:val="24"/>
+          <w:szCs w:val="24"/>
+        </w:rPr>
+        <w:t>termino</w:t>
+      </w:r>
+      <w:proofErr w:type="spellEnd"/>
+      <w:r>
+        <w:rPr>
+          <w:sz w:val="24"/>
+          <w:szCs w:val="24"/>
+        </w:rPr>
+        <w:t xml:space="preserve"> que aparece en todos los documentos (“Wikipedia”) con uno que es menos discriminativo (“</w:t>
+      </w:r>
+      <w:proofErr w:type="spellStart"/>
+      <w:r>
+        <w:rPr>
+          <w:sz w:val="24"/>
+          <w:szCs w:val="24"/>
+        </w:rPr>
+        <w:t>Languages</w:t>
+      </w:r>
+      <w:proofErr w:type="spellEnd"/>
+      <w:r>
+        <w:rPr>
+          <w:sz w:val="24"/>
+          <w:szCs w:val="24"/>
+        </w:rPr>
+        <w:t>”).</w:t>
       </w:r>
     </w:p>
     <w:p>
@@ -28550,30 +28714,78 @@
           <w:sz w:val="24"/>
           <w:szCs w:val="24"/>
         </w:rPr>
-        <w:t>Todos los documentos que devolvió TF-IDF tienen como título Languages. En cambio, BM25 devolvió documento con scores negativos y sin contener este termino como nombre de documento.</w:t>
-      </w:r>
-    </w:p>
-    <w:p>
-      <w:pPr>
-        <w:rPr>
-          <w:sz w:val="24"/>
-          <w:szCs w:val="24"/>
-        </w:rPr>
-      </w:pPr>
-    </w:p>
-    <w:p>
-      <w:pPr>
-        <w:rPr>
-          <w:sz w:val="24"/>
-          <w:szCs w:val="24"/>
-        </w:rPr>
-      </w:pPr>
-      <w:r>
-        <w:rPr>
-          <w:sz w:val="24"/>
-          <w:szCs w:val="24"/>
-        </w:rPr>
-        <w:t>Para finalizar el análisis, se calculo el coeficiente de correlación para los primeros 10, 25 y 50 resultados.</w:t>
+        <w:t xml:space="preserve">Todos los documentos que devolvió TF-IDF tienen como título </w:t>
+      </w:r>
+      <w:proofErr w:type="spellStart"/>
+      <w:r>
+        <w:rPr>
+          <w:sz w:val="24"/>
+          <w:szCs w:val="24"/>
+        </w:rPr>
+        <w:t>Languages</w:t>
+      </w:r>
+      <w:proofErr w:type="spellEnd"/>
+      <w:r>
+        <w:rPr>
+          <w:sz w:val="24"/>
+          <w:szCs w:val="24"/>
+        </w:rPr>
+        <w:t xml:space="preserve">. En cambio, BM25 devolvió documento con scores negativos y sin contener este </w:t>
+      </w:r>
+      <w:proofErr w:type="spellStart"/>
+      <w:r>
+        <w:rPr>
+          <w:sz w:val="24"/>
+          <w:szCs w:val="24"/>
+        </w:rPr>
+        <w:t>termino</w:t>
+      </w:r>
+      <w:proofErr w:type="spellEnd"/>
+      <w:r>
+        <w:rPr>
+          <w:sz w:val="24"/>
+          <w:szCs w:val="24"/>
+        </w:rPr>
+        <w:t xml:space="preserve"> como nombre de documento.</w:t>
+      </w:r>
+    </w:p>
+    <w:p>
+      <w:pPr>
+        <w:rPr>
+          <w:sz w:val="24"/>
+          <w:szCs w:val="24"/>
+        </w:rPr>
+      </w:pPr>
+    </w:p>
+    <w:p>
+      <w:pPr>
+        <w:rPr>
+          <w:sz w:val="24"/>
+          <w:szCs w:val="24"/>
+        </w:rPr>
+      </w:pPr>
+      <w:r>
+        <w:rPr>
+          <w:sz w:val="24"/>
+          <w:szCs w:val="24"/>
+        </w:rPr>
+        <w:t xml:space="preserve">Para finalizar el análisis, se </w:t>
+      </w:r>
+      <w:proofErr w:type="spellStart"/>
+      <w:r>
+        <w:rPr>
+          <w:sz w:val="24"/>
+          <w:szCs w:val="24"/>
+        </w:rPr>
+        <w:t>calculo</w:t>
+      </w:r>
+      <w:proofErr w:type="spellEnd"/>
+      <w:r>
+        <w:rPr>
+          <w:sz w:val="24"/>
+          <w:szCs w:val="24"/>
+        </w:rPr>
+        <w:t xml:space="preserve"> el coeficiente de correlación para los primeros 10, 25 y 50 resultados.</w:t>
       </w:r>
     </w:p>
     <w:p>
@@ -32545,7 +32757,23 @@
           <w:sz w:val="24"/>
           <w:szCs w:val="24"/>
         </w:rPr>
-        <w:t>Como puede verse en el gráfico, se hace visible el tradeoff entre Recall y Precisión donde, a medida que uno sube, el otro baja.</w:t>
+        <w:t xml:space="preserve">Como puede verse en el gráfico, se hace visible el </w:t>
+      </w:r>
+      <w:proofErr w:type="spellStart"/>
+      <w:r>
+        <w:rPr>
+          <w:sz w:val="24"/>
+          <w:szCs w:val="24"/>
+        </w:rPr>
+        <w:t>tradeoff</w:t>
+      </w:r>
+      <w:proofErr w:type="spellEnd"/>
+      <w:r>
+        <w:rPr>
+          <w:sz w:val="24"/>
+          <w:szCs w:val="24"/>
+        </w:rPr>
+        <w:t xml:space="preserve"> entre Recall y Precisión donde, a medida que uno sube, el otro baja.</w:t>
       </w:r>
     </w:p>
     <w:p>
@@ -32787,7 +33015,21 @@
           <w:sz w:val="24"/>
           <w:szCs w:val="24"/>
         </w:rPr>
-        <w:t xml:space="preserve">Sería necesaria tener un relevante mas para tener </w:t>
+        <w:t xml:space="preserve">Sería necesaria tener un relevante </w:t>
+      </w:r>
+      <w:r>
+        <w:rPr>
+          <w:sz w:val="24"/>
+          <w:szCs w:val="24"/>
+        </w:rPr>
+        <w:t>más</w:t>
+      </w:r>
+      <w:r>
+        <w:rPr>
+          <w:sz w:val="24"/>
+          <w:szCs w:val="24"/>
+        </w:rPr>
+        <w:t xml:space="preserve"> para tener </w:t>
       </w:r>
       <w:r>
         <w:rPr>
@@ -32801,22 +33043,43 @@
           <w:sz w:val="24"/>
           <w:szCs w:val="24"/>
         </w:rPr>
-        <w:t>4% de Recall.</w:t>
-      </w:r>
-    </w:p>
-    <w:p>
-      <w:pPr>
-        <w:rPr>
-          <w:sz w:val="24"/>
-          <w:szCs w:val="24"/>
-        </w:rPr>
-      </w:pPr>
-      <w:r>
-        <w:rPr>
-          <w:sz w:val="24"/>
-          <w:szCs w:val="24"/>
-        </w:rPr>
-        <w:t xml:space="preserve">Esto nos da una idea de que la cobertura de todos los documentos relevantes capturados por el sistema no es muy buena. Esto puede solucionarse con los 6 documentos relevantes que el sistema no recupero. </w:t>
+        <w:t>4% de Recall</w:t>
+      </w:r>
+      <w:r>
+        <w:rPr>
+          <w:sz w:val="24"/>
+          <w:szCs w:val="24"/>
+        </w:rPr>
+        <w:t>, o modificando el orden del ranking puede llegarse a ese valor.</w:t>
+      </w:r>
+    </w:p>
+    <w:p>
+      <w:pPr>
+        <w:rPr>
+          <w:sz w:val="24"/>
+          <w:szCs w:val="24"/>
+        </w:rPr>
+      </w:pPr>
+      <w:r>
+        <w:rPr>
+          <w:sz w:val="24"/>
+          <w:szCs w:val="24"/>
+        </w:rPr>
+        <w:t>Esto nos da una idea de que la cobertura de todos los documentos relevantes capturados por el sistema no es muy buena. Est</w:t>
+      </w:r>
+      <w:r>
+        <w:rPr>
+          <w:sz w:val="24"/>
+          <w:szCs w:val="24"/>
+        </w:rPr>
+        <w:t>e problema</w:t>
+      </w:r>
+      <w:r>
+        <w:rPr>
+          <w:sz w:val="24"/>
+          <w:szCs w:val="24"/>
+        </w:rPr>
+        <w:t xml:space="preserve"> puede solucionarse con los 6 documentos relevantes que el sistema no recupero. </w:t>
       </w:r>
     </w:p>
     <w:p>
@@ -32885,14 +33148,7 @@
           <w:sz w:val="24"/>
           <w:szCs w:val="24"/>
         </w:rPr>
-        <w:t>(relevantes en el top R) / R</w:t>
-      </w:r>
-      <w:r>
-        <w:rPr>
-          <w:sz w:val="24"/>
-          <w:szCs w:val="24"/>
-        </w:rPr>
-        <w:t xml:space="preserve"> </w:t>
+        <w:t xml:space="preserve">(relevantes en el top R) / R </w:t>
       </w:r>
     </w:p>
     <w:p>
@@ -33063,6 +33319,7 @@
         <w:rPr>
           <w:noProof/>
         </w:rPr>
+        <w:lastRenderedPageBreak/>
         <w:drawing>
           <wp:inline distT="0" distB="0" distL="0" distR="0" wp14:anchorId="0C7BF417" wp14:editId="0A4FC1BE">
             <wp:extent cx="2619741" cy="495369"/>
@@ -33119,7 +33376,6 @@
           <w:sz w:val="24"/>
           <w:szCs w:val="24"/>
         </w:rPr>
-        <w:lastRenderedPageBreak/>
         <w:t xml:space="preserve">i = 1 </w:t>
       </w:r>
       <w:r>
@@ -33473,7 +33729,25 @@
           <w:szCs w:val="24"/>
           <w:lang w:val="es-AR"/>
         </w:rPr>
-        <w:t>n sistema para posicionar el primer resultado relevante lo mas alto posible en una lista ordenada. Formula:</w:t>
+        <w:t xml:space="preserve">n sistema para posicionar el primer resultado relevante lo </w:t>
+      </w:r>
+      <w:proofErr w:type="spellStart"/>
+      <w:r>
+        <w:rPr>
+          <w:sz w:val="24"/>
+          <w:szCs w:val="24"/>
+          <w:lang w:val="es-AR"/>
+        </w:rPr>
+        <w:t>mas</w:t>
+      </w:r>
+      <w:proofErr w:type="spellEnd"/>
+      <w:r>
+        <w:rPr>
+          <w:sz w:val="24"/>
+          <w:szCs w:val="24"/>
+          <w:lang w:val="es-AR"/>
+        </w:rPr>
+        <w:t xml:space="preserve"> alto posible en una lista ordenada. Formula:</w:t>
       </w:r>
     </w:p>
     <w:p>
@@ -33633,7 +33907,25 @@
           <w:szCs w:val="24"/>
           <w:lang w:val="es-AR"/>
         </w:rPr>
-        <w:t xml:space="preserve"> del primer documento relevante para la i-esima consulta.</w:t>
+        <w:t xml:space="preserve"> del primer documento relevante para la i-</w:t>
+      </w:r>
+      <w:proofErr w:type="spellStart"/>
+      <w:r>
+        <w:rPr>
+          <w:sz w:val="24"/>
+          <w:szCs w:val="24"/>
+          <w:lang w:val="es-AR"/>
+        </w:rPr>
+        <w:t>esima</w:t>
+      </w:r>
+      <w:proofErr w:type="spellEnd"/>
+      <w:r>
+        <w:rPr>
+          <w:sz w:val="24"/>
+          <w:szCs w:val="24"/>
+          <w:lang w:val="es-AR"/>
+        </w:rPr>
+        <w:t xml:space="preserve"> consulta.</w:t>
       </w:r>
     </w:p>
     <w:p>
@@ -33794,6 +34086,7 @@
         <w:rPr>
           <w:b/>
           <w:bCs/>
+          <w:noProof/>
           <w:sz w:val="24"/>
           <w:szCs w:val="24"/>
           <w:lang w:val="es-AR"/>
@@ -33911,6 +34204,7 @@
       </w:pPr>
       <w:r>
         <w:rPr>
+          <w:noProof/>
           <w:color w:val="FABF8F" w:themeColor="accent6" w:themeTint="99"/>
           <w:sz w:val="24"/>
           <w:szCs w:val="24"/>
@@ -34045,7 +34339,23 @@
           <w:szCs w:val="24"/>
         </w:rPr>
         <w:lastRenderedPageBreak/>
-        <w:t xml:space="preserve">Se le solicito a la inteligencia artificial la construcción de las grafica interpolada y no interpolada del sistema a través de un pequeño labo en Python, con el fin de hacer más énfasis en el análisis de las métricas y no en el código que genera el grafico.  </w:t>
+        <w:t xml:space="preserve">Se le solicito a la inteligencia artificial la construcción de las grafica interpolada y no interpolada del sistema a través de un pequeño </w:t>
+      </w:r>
+      <w:proofErr w:type="spellStart"/>
+      <w:r>
+        <w:rPr>
+          <w:sz w:val="24"/>
+          <w:szCs w:val="24"/>
+        </w:rPr>
+        <w:t>labo</w:t>
+      </w:r>
+      <w:proofErr w:type="spellEnd"/>
+      <w:r>
+        <w:rPr>
+          <w:sz w:val="24"/>
+          <w:szCs w:val="24"/>
+        </w:rPr>
+        <w:t xml:space="preserve"> en Python, con el fin de hacer más énfasis en el análisis de las métricas y no en el código que genera el grafico.  </w:t>
       </w:r>
     </w:p>
     <w:p>
@@ -34175,7 +34485,25 @@
           <w:sz w:val="24"/>
           <w:szCs w:val="24"/>
         </w:rPr>
-        <w:t>Individual (por query), para las mismas métricas, calculando la distribución de los valores en cada caso.</w:t>
+        <w:t xml:space="preserve">Individual (por </w:t>
+      </w:r>
+      <w:proofErr w:type="spellStart"/>
+      <w:r>
+        <w:rPr>
+          <w:color w:val="FABF8F" w:themeColor="accent6" w:themeTint="99"/>
+          <w:sz w:val="24"/>
+          <w:szCs w:val="24"/>
+        </w:rPr>
+        <w:t>query</w:t>
+      </w:r>
+      <w:proofErr w:type="spellEnd"/>
+      <w:r>
+        <w:rPr>
+          <w:color w:val="FABF8F" w:themeColor="accent6" w:themeTint="99"/>
+          <w:sz w:val="24"/>
+          <w:szCs w:val="24"/>
+        </w:rPr>
+        <w:t>), para las mismas métricas, calculando la distribución de los valores en cada caso.</w:t>
       </w:r>
     </w:p>
     <w:p>

</xml_diff>